<commit_message>
Implementa módulo de cobros
</commit_message>
<xml_diff>
--- a/documentacion.docx
+++ b/documentacion.docx
@@ -4445,42 +4445,48 @@
         <w:rPr>
           <w:lang w:val="es-NI"/>
         </w:rPr>
-        <w:t/>
+        <w:t>
+        </w:t>
       </w:r>
       <w:proofErr w:type="spellEnd"/>
       <w:r>
         <w:rPr>
           <w:lang w:val="es-NI"/>
         </w:rPr>
-        <w:t xml:space="preserve"/>
+        <w:t xml:space="preserve">
+        </w:t>
       </w:r>
       <w:proofErr w:type="spellStart"/>
       <w:r>
         <w:rPr>
           <w:lang w:val="es-NI"/>
         </w:rPr>
-        <w:t/>
+        <w:t>
+        </w:t>
       </w:r>
       <w:proofErr w:type="spellEnd"/>
       <w:r>
         <w:rPr>
           <w:lang w:val="es-NI"/>
         </w:rPr>
-        <w:t xml:space="preserve"/>
+        <w:t xml:space="preserve">
+        </w:t>
       </w:r>
       <w:proofErr w:type="spellStart"/>
       <w:r>
         <w:rPr>
           <w:lang w:val="es-NI"/>
         </w:rPr>
-        <w:t/>
+        <w:t>
+        </w:t>
       </w:r>
       <w:proofErr w:type="spellEnd"/>
       <w:r>
         <w:rPr>
           <w:lang w:val="es-NI"/>
         </w:rPr>
-        <w:t/>
+        <w:t>
+        </w:t>
       </w:r>
     </w:p>
     <w:p>
@@ -54516,6 +54522,27 @@
         <w:t>Cabecera de los cobros recibidos de clientes, indicando caja, método, moneda y referencia.</w:t>
       </w:r>
     </w:p>
+    <w:p>
+      <w:pPr>
+        <w:rPr>
+          <w:lang w:val="es-NI"/>
+        </w:rPr>
+      </w:pPr>
+      <w:r>
+        <w:rPr>
+          <w:b/>
+          <w:lang w:val="es-NI"/>
+        </w:rPr>
+        <w:t xml:space="preserve">Reglas / criterios: COBROS SE REGISTRA POR CLIENTE y sus líneas reparten el dinero entre ingresos concretos de sus órdenes; un cobro no pertenece a una sola orden. El total se calcula como la suma de las líneas y no se acepta escrito desde el formulario. Cada línea debe indicar un ingreso del mismo cliente, y un ingreso no se repite dentro del mismo cobro. Se permiten cobros parciales: el mismo ingreso puede recibir asignaciones en cobros distintos. No se permite sobrecobrar cuando el ingreso y el cobro usan la misma moneda; si son distintas no existe conversión guardada para compararlos y la aplicación informa que no puede comprobar el saldo. Los importes de las líneas están en la moneda del cobro. Solo los cobros Finalizados cuentan como dinero recibido y reducen lo pendiente; Pendiente y En proceso aún no confirman que el dinero llegó, y Cancelada no cuenta. Caja, método de pago y moneda nuevos solo se eligen entre registros activos; los valores ya usados siguen visibles en las fichas aunque después se desactiven. Un cobro Finalizado se puede corregir. Para anularlo se conserva como Cancelada; eliminarlo borra también sus líneas por ON DELETE CASCADE y se reserva para registros que nunca debieron existir.</w:t>
+      </w:r>
+      <w:r>
+        <w:rPr>
+          <w:lang w:val="es-NI"/>
+        </w:rPr>
+        <w:t xml:space="preserve">
+        </w:t>
+      </w:r>
+    </w:p>
     <w:tbl>
       <w:tblPr>
         <w:tblStyle w:val="Tablaconcuadrcula"/>
@@ -56707,6 +56734,27 @@
           <w:lang w:val="es-NI"/>
         </w:rPr>
         <w:t>Distribución de un cobro entre uno o varios ingresos.</w:t>
+      </w:r>
+    </w:p>
+    <w:p>
+      <w:pPr>
+        <w:rPr>
+          <w:lang w:val="es-NI"/>
+        </w:rPr>
+      </w:pPr>
+      <w:r>
+        <w:rPr>
+          <w:b/>
+          <w:lang w:val="es-NI"/>
+        </w:rPr>
+        <w:t xml:space="preserve">Reglas / criterios: CADA LÍNEA DE DETALLE asigna una parte del cobro a un ingreso del mismo cliente. El monto de la línea se expresa en la moneda del cobro y la suma de las líneas determina el total de la cabecera. Un mismo ingreso puede aparecer en distintos cobros para permitir pagos parciales, pero no dos veces en el mismo cobro. Al quitar una línea se da de baja lógicamente para que deje de participar en el total y en el saldo; si se vuelve a agregar se recupera esa línea en vez de crear un duplicado. Las líneas de un cobro Cancelado o no Finalizado no representan dinero recibido. Al eliminar la cabecera, la clave ON DELETE CASCADE elimina físicamente sus líneas.</w:t>
+      </w:r>
+      <w:r>
+        <w:rPr>
+          <w:lang w:val="es-NI"/>
+        </w:rPr>
+        <w:t xml:space="preserve">
+        </w:t>
       </w:r>
     </w:p>
     <w:tbl>
@@ -68746,6 +68794,19 @@
         <w:rPr>
           <w:lang w:val="es-NI"/>
         </w:rPr>
+        <w:t xml:space="preserve">Cambios sin cambio de esquema: se documentan las reglas de cobros y sus líneas de reparto. La versión del documento se queda en 1.5 porque las tablas cobros y detalle_cobros y sus columnas ya existían; este cambio describe la lógica de negocio y las pantallas implementadas, sin modificar el esquema.</w:t>
+      </w:r>
+    </w:p>
+    <w:p>
+      <w:pPr>
+        <w:rPr>
+          <w:lang w:val="es-NI"/>
+        </w:rPr>
+      </w:pPr>
+      <w:r>
+        <w:rPr>
+          <w:lang w:val="es-NI"/>
+        </w:rPr>
         <w:t xml:space="preserve">Cambios sin cambio de esquema: se documenta el panel de inicio en el capítulo de reglas de negocio, y la versión del documento se queda en 1.5 porque no cambia ninguna tabla. La raíz "/" pasa a exigir sesión, que antes no la exigía porque era una página de bienvenida vacía.</w:t>
       </w:r>
     </w:p>

</xml_diff>

<commit_message>
Implementa cierres de caja por período
</commit_message>
<xml_diff>
--- a/documentacion.docx
+++ b/documentacion.docx
@@ -57,7 +57,7 @@
         </w:rPr>
       </w:pPr>
       <w:r>
-        <w:t xml:space="preserve">Versión documental: 1.5</w:t>
+        <w:t xml:space="preserve">Versión documental: 1.6</w:t>
       </w:r>
     </w:p>
     <w:p>
@@ -71,7 +71,7 @@
         <w:rPr>
           <w:lang w:val="es-NI"/>
         </w:rPr>
-        <w:t xml:space="preserve">Fecha: 26/09/2026</w:t>
+        <w:t xml:space="preserve">Fecha: 10/10/2026</w:t>
       </w:r>
     </w:p>
     <w:p>
@@ -3805,7 +3805,7 @@
         <w:rPr>
           <w:lang w:val="es-NI"/>
         </w:rPr>
-        <w:t xml:space="preserve">36 tablas del modelo actual. Las tablas 35 y 36 (equipos y proceso_equipos) se agregaron despues, para la depreciacion de los equipos por proceso.</w:t>
+        <w:t xml:space="preserve">38 tablas del modelo actual. Las tablas 35 y 36 (equipos y proceso_equipos) se agregaron para la depreciacion de los equipos por proceso; las tablas 37 y 38 (cierres_caja y detalle_cierres_caja) se agregan en la version 1.6.</w:t>
       </w:r>
     </w:p>
     <w:p>
@@ -68873,6 +68873,61 @@
         <w:t>Para futuras auditorías, se recomienda conservar este documento junto con los scripts SQL/migraciones de Laravel que correspondan a la misma versión de la base de datos.</w:t>
       </w:r>
     </w:p>
+    <w:p>
+      <w:r>
+        <w:t xml:space="preserve">ACTUALIZACI?N DE ESQUEMA ? VERSI?N DOCUMENTAL 1.6</w:t>
+      </w:r>
+    </w:p>
+    <w:p>
+      <w:r>
+        <w:t xml:space="preserve">Se agregan las tablas cierres_caja y detalle_cierres_caja para conciliar cobros recibidos por caja durante un per?odo. Estos registros son distintos de cierres_orden, que consolida una orden de trabajo.</w:t>
+      </w:r>
+    </w:p>
+    <w:p>
+      <w:r>
+        <w:t xml:space="preserve">37. cierres_caja</w:t>
+      </w:r>
+    </w:p>
+    <w:p>
+      <w:r>
+        <w:t xml:space="preserve">Cabecera hist?rica de un cierre de caja por per?odo. codigo es un identificador ?nico; caja_id referencia cajas; fecha_desde y fecha_hasta delimitan el per?odo; observaciones guarda notas opcionales. Incluye timestamps y deleted_at. No se permiten per?odos superpuestos para una misma caja.</w:t>
+      </w:r>
+    </w:p>
+    <w:p>
+      <w:r>
+        <w:t xml:space="preserve">38. detalle_cierres_caja</w:t>
+      </w:r>
+    </w:p>
+    <w:p>
+      <w:r>
+        <w:t xml:space="preserve">Desglose del cierre por m?todo de pago y moneda. cierre_caja_id referencia cierres_caja; metodo_pago_id referencia metodos_pago; moneda_id referencia monedas; monto_esperado es la suma de las l?neas de cobros Finalizados de la caja dentro del per?odo; monto_contado es la cantidad conciliada que registra el usuario; diferencia = monto_contado - monto_esperado. La combinaci?n cierre_caja_id, metodo_pago_id y moneda_id es ?nica.</w:t>
+      </w:r>
+    </w:p>
+    <w:p>
+      <w:r>
+        <w:t xml:space="preserve">Reglas de Cierres de caja</w:t>
+      </w:r>
+    </w:p>
+    <w:p>
+      <w:r>
+        <w:t xml:space="preserve">Solo cuentan cobros Finalizados y l?neas activas de cobro. Pendiente, En proceso y Cancelada se excluyen. Los montos se agrupan por m?todo y moneda; nunca se suman monedas distintas. Cada cierre conserva los importes esperados, contados y diferencia como una captura hist?rica, de modo que una correcci?n posterior del cobro no reescribe la conciliaci?n.</w:t>
+      </w:r>
+    </w:p>
+    <w:p>
+      <w:r>
+        <w:t xml:space="preserve">El cierre de caja es una conciliaci?n por caja y per?odo; cierres_orden sigue representando el cierre comercial de una orden. El sistema impide crear otro cierre que se cruce en fechas con uno existente para la misma caja.</w:t>
+      </w:r>
+    </w:p>
+    <w:p>
+      <w:r>
+        <w:t xml:space="preserve">Estructura de cierres_caja: id BIGINT UNSIGNED, clave primaria; codigo VARCHAR(30), no nulo y ?nico; caja_id BIGINT UNSIGNED, no nulo, FK a cajas con restricci?n de borrado; fecha_desde DATE y fecha_hasta DATE, no nulas; observaciones TEXT, nullable; created_at, updated_at y deleted_at.</w:t>
+      </w:r>
+    </w:p>
+    <w:p>
+      <w:r>
+        <w:t xml:space="preserve">Estructura de detalle_cierres_caja: id BIGINT UNSIGNED, clave primaria; cierre_caja_id, metodo_pago_id y moneda_id BIGINT UNSIGNED, no nulos y con FK; monto_esperado, monto_contado y diferencia DECIMAL(14,2), no nulos y con default 0; created_at y updated_at. La combinaci?n cierre_caja_id + metodo_pago_id + moneda_id tiene ?ndice ?nico.</w:t>
+      </w:r>
+    </w:p>
     <w:sectPr>
       <w:footerReference w:type="default" r:id="rId8"/>
       <w:pgSz w:w="12240" w:h="15840"/>

</xml_diff>

<commit_message>
Implementa movimientos de caja y saldo acumulado
</commit_message>
<xml_diff>
--- a/documentacion.docx
+++ b/documentacion.docx
@@ -3805,7 +3805,7 @@
         <w:rPr>
           <w:lang w:val="es-NI"/>
         </w:rPr>
-        <w:t xml:space="preserve">38 tablas del modelo actual. Las tablas 35 y 36 (equipos y proceso_equipos) se agregaron para la depreciacion de los equipos por proceso; las tablas 37 y 38 (cierres_caja y detalle_cierres_caja) se agregan en la version 1.6.</w:t>
+        <w:t xml:space="preserve">39 tablas del modelo actual. Las tablas 35 y 36 (equipos y proceso_equipos) se agregaron para la depreciaci?n de los equipos por proceso; las tablas 37 y 38 (cierres_caja y detalle_cierres_caja) se agregaron en la versi?n 1.6, y la tabla 39 (movimientos_caja) se agrega en la versi?n 1.7.</w:t>
       </w:r>
     </w:p>
     <w:p>
@@ -68935,6 +68935,63 @@
       <w:cols w:space="720"/>
       <w:docGrid w:linePitch="360"/>
     </w:sectPr>
+    <w:p>
+      <w:r>
+        <w:rPr>
+          <w:b/>
+        </w:rPr>
+        <w:t xml:space="preserve">ACTUALIZACI?N DE ESQUEMA ? VERSI?N DOCUMENTAL 1.7</w:t>
+      </w:r>
+    </w:p>
+    <w:p>
+      <w:r>
+        <w:t xml:space="preserve">Se agrega movimientos_caja como libro hist?rico de entradas y salidas. La migraci?n importa los cobros Finalizados existentes, una entrada por cobro y con el importe de sus l?neas activas, para que el saldo actual no se pierda al iniciar el libro.</w:t>
+      </w:r>
+    </w:p>
+    <w:p>
+      <w:r>
+        <w:rPr>
+          <w:b/>
+        </w:rPr>
+        <w:t xml:space="preserve">39. movimientos_caja</w:t>
+      </w:r>
+    </w:p>
+    <w:p>
+      <w:r>
+        <w:rPr>
+          <w:b/>
+        </w:rPr>
+        <w:t xml:space="preserve">Registra cada variaci?n de dinero en una caja, con fecha, m?todo de pago, moneda, importe positivo, descripci?n y referencia. tipo distingue entrada y salida; origen identifica cobro, movimiento manual, saldo inicial, transferencia o reverso. codigo es ?nico. caja_id, metodo_pago_id y moneda_id son claves for?neas restrictivas. cobro_id es nullable y queda en NULL si se elimina la cabecera del cobro; registrado_por tambi?n es nullable y queda en NULL al eliminarse el usuario. transferencia_id enlaza el movimiento de la otra caja y reversa_de_id enlaza el movimiento corregido; reversa_de_id es ?nico para que un mismo movimiento no se revierta dos veces. La tabla no usa borrado l?gico: el libro es inmutable.</w:t>
+      </w:r>
+    </w:p>
+    <w:p>
+      <w:r>
+        <w:t xml:space="preserve">Reglas de movimientos de caja</w:t>
+      </w:r>
+    </w:p>
+    <w:p>
+      <w:r>
+        <w:rPr>
+          <w:b/>
+        </w:rPr>
+        <w:t xml:space="preserve">Solo un cobro Finalizado produce una entrada autom?tica. Pendiente, En proceso y Cancelada no registran dinero recibido. Al corregir un cobro Finalizado se registra un movimiento inverso con fecha de la correcci?n y una nueva entrada con los datos vigentes; cancelarlo o eliminarlo registra solo el reverso. As?, la correcci?n no borra el rastro ni duplica el saldo. Las entradas manuales, los egresos y los saldos iniciales se registran con caja, m?todo y moneda, sin mezclar monedas. Cada caja, m?todo y moneda admite un ?nico saldo inicial. Una transferencia genera en una misma transacci?n una salida en la caja origen y una entrada enlazada en la caja destino, por el mismo importe, m?todo y moneda.</w:t>
+      </w:r>
+    </w:p>
+    <w:p>
+      <w:r>
+        <w:t xml:space="preserve">Saldos y cierres de caja</w:t>
+      </w:r>
+    </w:p>
+    <w:p>
+      <w:r>
+        <w:t xml:space="preserve">El saldo actual se calcula sumando entradas y restando salidas por caja y moneda. El cierre calcula el saldo acumulado hasta fecha_hasta, agrupado por m?todo de pago y moneda; los movimientos anteriores al per?odo forman el saldo de apertura. monto_contado se compara con ese saldo esperado y diferencia = monto_contado - monto_esperado. Cada cierre conserva su captura hist?rica, aunque se registren movimientos posteriores. Los per?odos superpuestos de una misma caja siguen rechaz?ndose.</w:t>
+      </w:r>
+    </w:p>
+    <w:p>
+      <w:r>
+        <w:t xml:space="preserve">Estructura de movimientos_caja: id BIGINT UNSIGNED, clave primaria; codigo VARCHAR(40), no nulo y ?nico; caja_id BIGINT UNSIGNED, no nulo, FK a cajas con restricci?n de borrado; fecha DATE, no nula; tipo y origen VARCHAR(30), no nulos; metodo_pago_id y moneda_id BIGINT UNSIGNED, no nulos y con FK restrictiva; monto DECIMAL(14,2), no nulo; descripcion VARCHAR(255), no nula; referencia VARCHAR(100), nullable; cobro_id BIGINT UNSIGNED, nullable, FK a cobros con ON DELETE SET NULL; transferencia_id y reversa_de_id BIGINT UNSIGNED, nullable, FK a movimientos_caja; reversa_de_id es ?nico; registrado_por BIGINT UNSIGNED, nullable, FK a users con ON DELETE SET NULL; created_at y updated_at.</w:t>
+      </w:r>
+    </w:p>
   </w:body>
 </w:document>
 </file>
</xml_diff>

<commit_message>
Asigna una caja de trabajo a cada usuario
</commit_message>
<xml_diff>
--- a/documentacion.docx
+++ b/documentacion.docx
@@ -1,6 +1,6 @@
 
 <file path=word/document.xml><?xml version="1.0" encoding="utf-8"?>
-<w:document xmlns:wpc="http://schemas.microsoft.com/office/word/2010/wordprocessingCanvas" xmlns:cx="http://schemas.microsoft.com/office/drawing/2014/chartex" xmlns:cx1="http://schemas.microsoft.com/office/drawing/2015/9/8/chartex" xmlns:cx2="http://schemas.microsoft.com/office/drawing/2015/10/21/chartex" xmlns:cx3="http://schemas.microsoft.com/office/drawing/2016/5/9/chartex" xmlns:cx4="http://schemas.microsoft.com/office/drawing/2016/5/10/chartex" xmlns:cx5="http://schemas.microsoft.com/office/drawing/2016/5/11/chartex" xmlns:cx6="http://schemas.microsoft.com/office/drawing/2016/5/12/chartex" xmlns:cx7="http://schemas.microsoft.com/office/drawing/2016/5/13/chartex" xmlns:cx8="http://schemas.microsoft.com/office/drawing/2016/5/14/chartex" xmlns:mc="http://schemas.openxmlformats.org/markup-compatibility/2006" xmlns:aink="http://schemas.microsoft.com/office/drawing/2016/ink" xmlns:am3d="http://schemas.microsoft.com/office/drawing/2017/model3d" xmlns:o="urn:schemas-microsoft-com:office:office" xmlns:oel="http://schemas.microsoft.com/office/2019/extlst" xmlns:r="http://schemas.openxmlformats.org/officeDocument/2006/relationships" xmlns:m="http://schemas.openxmlformats.org/officeDocument/2006/math" xmlns:v="urn:schemas-microsoft-com:vml" xmlns:wp14="http://schemas.microsoft.com/office/word/2010/wordprocessingDrawing" xmlns:wp="http://schemas.openxmlformats.org/drawingml/2006/wordprocessingDrawing" xmlns:w10="urn:schemas-microsoft-com:office:word" xmlns:w="http://schemas.openxmlformats.org/wordprocessingml/2006/main" xmlns:w14="http://schemas.microsoft.com/office/word/2010/wordml" xmlns:w15="http://schemas.microsoft.com/office/word/2012/wordml" xmlns:w16cex="http://schemas.microsoft.com/office/word/2018/wordml/cex" xmlns:w16cid="http://schemas.microsoft.com/office/word/2016/wordml/cid" xmlns:w16="http://schemas.microsoft.com/office/word/2018/wordml" xmlns:w16sdtdh="http://schemas.microsoft.com/office/word/2020/wordml/sdtdatahash" xmlns:w16se="http://schemas.microsoft.com/office/word/2015/wordml/symex" xmlns:wpg="http://schemas.microsoft.com/office/word/2010/wordprocessingGroup" xmlns:wpi="http://schemas.microsoft.com/office/word/2010/wordprocessingInk" xmlns:wne="http://schemas.microsoft.com/office/word/2006/wordml" xmlns:wps="http://schemas.microsoft.com/office/word/2010/wordprocessingShape" mc:Ignorable="w14 w15 w16se w16cid w16 w16cex w16sdtdh wp14">
+<w:document xmlns:mc="http://schemas.openxmlformats.org/markup-compatibility/2006" xmlns:r="http://schemas.openxmlformats.org/officeDocument/2006/relationships" xmlns:w="http://schemas.openxmlformats.org/wordprocessingml/2006/main" xmlns:w14="http://schemas.microsoft.com/office/word/2010/wordml" mc:Ignorable="w14 w15 w16se w16cid w16 w16cex w16sdtdh wp14">
   <w:body>
     <w:p>
       <w:pPr>
@@ -57,7 +57,7 @@
         </w:rPr>
       </w:pPr>
       <w:r>
-        <w:t xml:space="preserve">Versión documental: 1.6</w:t>
+        <w:t xml:space="preserve">Versión documental: 1.8</w:t>
       </w:r>
     </w:p>
     <w:p>
@@ -3805,7 +3805,7 @@
         <w:rPr>
           <w:lang w:val="es-NI"/>
         </w:rPr>
-        <w:t xml:space="preserve">39 tablas del modelo actual. Las tablas 35 y 36 (equipos y proceso_equipos) se agregaron para la depreciaci?n de los equipos por proceso; las tablas 37 y 38 (cierres_caja y detalle_cierres_caja) se agregaron en la versi?n 1.6, y la tabla 39 (movimientos_caja) se agrega en la versi?n 1.7.</w:t>
+        <w:t xml:space="preserve">39 tablas del modelo actual. Las tablas 35 y 36 (equipos y proceso_equipos) se agregaron para la depreciación de los equipos por proceso; las tablas 37 y 38 (cierres_caja y detalle_cierres_caja) se agregaron en la versión 1.6, la tabla 39 (movimientos_caja) en la versión 1.7, y users.caja_id en la versión 1.8.</w:t>
       </w:r>
     </w:p>
     <w:p>
@@ -68992,6 +68992,39 @@
         <w:t xml:space="preserve">Estructura de movimientos_caja: id BIGINT UNSIGNED, clave primaria; codigo VARCHAR(40), no nulo y ?nico; caja_id BIGINT UNSIGNED, no nulo, FK a cajas con restricci?n de borrado; fecha DATE, no nula; tipo y origen VARCHAR(30), no nulos; metodo_pago_id y moneda_id BIGINT UNSIGNED, no nulos y con FK restrictiva; monto DECIMAL(14,2), no nulo; descripcion VARCHAR(255), no nula; referencia VARCHAR(100), nullable; cobro_id BIGINT UNSIGNED, nullable, FK a cobros con ON DELETE SET NULL; transferencia_id y reversa_de_id BIGINT UNSIGNED, nullable, FK a movimientos_caja; reversa_de_id es ?nico; registrado_por BIGINT UNSIGNED, nullable, FK a users con ON DELETE SET NULL; created_at y updated_at.</w:t>
       </w:r>
     </w:p>
+    <w:p>
+      <w:r>
+        <w:rPr>
+          <w:b/>
+        </w:rPr>
+        <w:t xml:space="preserve">ACTUALIZACIÓN DE ESQUEMA — VERSIÓN DOCUMENTAL 1.8</w:t>
+      </w:r>
+    </w:p>
+    <w:p>
+      <w:r>
+        <w:t xml:space="preserve">La tabla users incorpora caja_id BIGINT UNSIGNED nullable, con clave foránea restrictiva a cajas.id. Cada cuenta tiene una caja de trabajo asignada. La columna permite conservar cuentas existentes sin inventar a qué caja pertenecen; una cuenta solo puede iniciar sesión cuando tiene una caja asignada y activa.</w:t>
+      </w:r>
+    </w:p>
+    <w:p>
+      <w:r>
+        <w:t xml:space="preserve">Al autenticarse (también después de completar la verificación en dos pasos), el sistema carga automáticamente la caja asignada a users.caja_id en la sesión. Se elimina el selector de caja del login. Las cuentas sin caja o con una caja inactiva reciben un aviso y no completan el acceso. La caja asignada no se puede borrar mientras haya usuarios asociados.</w:t>
+      </w:r>
+    </w:p>
+    <w:p>
+      <w:r>
+        <w:t xml:space="preserve">La asignación se realiza mediante php artisan mina:asignar-caja {usuario} {caja_id}; usuario acepta el correo o el ID y caja_id debe pertenecer a una caja activa. Al crear el administrador con mina:crear-admin se indica también --caja-id.</w:t>
+      </w:r>
+    </w:p>
+    <w:p>
+      <w:r>
+        <w:t xml:space="preserve">La pantalla de movimientos de caja muestra únicamente los movimientos y saldos de la caja vinculada al usuario. El resumen mantiene una fila por moneda y presenta saldo inicial, entradas, salidas y saldo final; no suma monedas distintas. En una transferencia, el usuario opera desde su caja asignada y puede elegir una caja de destino.</w:t>
+      </w:r>
+    </w:p>
+    <w:p>
+      <w:r>
+        <w:t xml:space="preserve">Estructura añadida a users: caja_id BIGINT UNSIGNED, nullable, FK a cajas.id con ON DELETE RESTRICT. La asignación de caja es un dato de acceso y contexto de operación, no se guarda una copia de la caja en cada sesión.</w:t>
+      </w:r>
+    </w:p>
   </w:body>
 </w:document>
 </file>
</xml_diff>

<commit_message>
Consolida costos de proceso en NIO
</commit_message>
<xml_diff>
--- a/documentacion.docx
+++ b/documentacion.docx
@@ -12469,7 +12469,7 @@
           <w:b/>
           <w:lang w:val="es-NI"/>
         </w:rPr>
-        <w:t xml:space="preserve">Reglas / criterios: los valores originales conservan la moneda de la operación y costo_unitario_nio y costo_total_nio guardan el equivalente histórico. costo_total se calcula en el servidor como cantidad por costo_unitario y no se acepta del formulario: si se recibiera ya calculado, un valor equivocado se guardaría como si fuera verdad. El tipo de cambio se centraliza en TiposCambio::vigentePara() porque lo necesitan también los trabajos de los empleados, y la documentación pide justo eso para que dos copias de la misma regla no den números distintos. La moneda base vale 1 por definición y no consulta tipos_cambio. Si una fila contiene orden_trabajo_id y proceso_orden_id, hay que comprobar que el proceso pertenece a esa misma OT; esa comprobación vive en el modelo para que ninguna pantalla la esquive. Solo se ofrecen categorías con automatica en 0.</w:t>
+        <w:t xml:space="preserve">Reglas / criterios: los valores originales conservan la moneda de la operación y costo_unitario_nio y costo_total_nio guardan el equivalente histórico. costo_total se calcula en el servidor como cantidad por costo_unitario y no se acepta del formulario: si se recibiera ya calculado, un valor equivocado se guardaría como si fuera verdad. El tipo de cambio se centraliza en TiposCambio::delDia() porque lo necesitan también los trabajos de los empleados, y la documentación pide justo eso para que dos copias de la misma regla no den números distintos. La moneda base vale 1 por definición y no consulta tipos_cambio. Si una fila contiene orden_trabajo_id y proceso_orden_id, hay que comprobar que el proceso pertenece a esa misma OT; esa comprobación vive en el modelo para que ninguna pantalla la esquive. Solo se ofrecen categorías con automatica en 0.</w:t>
       </w:r>
     </w:p>
     <w:tbl>
@@ -69025,6 +69025,39 @@
         <w:t xml:space="preserve">Estructura añadida a users: caja_id BIGINT UNSIGNED, nullable, FK a cajas.id con ON DELETE RESTRICT. La asignación de caja es un dato de acceso y contexto de operación, no se guarda una copia de la caja en cada sesión.</w:t>
       </w:r>
     </w:p>
+    <w:p>
+      <w:pPr>
+        <w:pStyle w:val="Heading1"/>
+      </w:pPr>
+      <w:r>
+        <w:t>Reglas de costos por proceso y moneda (actualizaci?n 10/10/2026)</w:t>
+      </w:r>
+    </w:p>
+    <w:p>
+      <w:r>
+        <w:t>La moneda base para consolidar los costos de ?rdenes y procesos es NIO. Mano de obra, gastos manuales y consumos de materia prima se suman por su equivalente NIO; los importes originales se conservan con su moneda de operaci?n. El desglose de costos del proceso se presenta en NIO.</w:t>
+      </w:r>
+    </w:p>
+    <w:p>
+      <w:r>
+        <w:t>Para una operaci?n en moneda extranjera, el sistema requiere un tipo de cambio registrado para la fecha exacta de la operaci?n. No se reutiliza una tasa de un d?a anterior ni se usa una paridad de respaldo. Si falta, el registro se rechaza con la indicaci?n de cargar primero el tipo de cambio en Configuraci?n &gt; Tipos de cambio. La moneda base equivale a 1.</w:t>
+      </w:r>
+    </w:p>
+    <w:p>
+      <w:r>
+        <w:t>Las compras en moneda extranjera y las entradas de inventario requieren la tasa del d?a. Las salidas de inventario se valoran al costo promedio del almac?n, expresado en NIO. El tipo de cambio hist?rico aplicado queda guardado en los movimientos.</w:t>
+      </w:r>
+    </w:p>
+    <w:p>
+      <w:r>
+        <w:t>Un proceso Finalizado o Cancelado no admite nuevas altas de trabajos, consumos, asignaciones de equipo ni costos. Los registros existentes pueden corregirse. No se permite dar de baja un proceso que conserve registros asociados (incluidos los dados de baja l?gicamente), para preservar el historial.</w:t>
+      </w:r>
+    </w:p>
+    <w:p>
+      <w:r>
+        <w:t>Los costos generales de una orden no se distribuyen autom?ticamente entre sus procesos y no forman parte del costo desglosado de un proceso hasta que se defina una regla de asignaci?n. Estas reglas son de aplicaci?n y no modifican el esquema de la base de datos; por ello no se incrementa la versi?n del esquema.</w:t>
+      </w:r>
+    </w:p>
   </w:body>
 </w:document>
 </file>
</xml_diff>